<commit_message>
refactor: transition Streamlit UI to light theme and automate high-resolution documentation screenshots
</commit_message>
<xml_diff>
--- a/docs/Chapter_5_Eunice.docx
+++ b/docs/Chapter_5_Eunice.docx
@@ -45,7 +45,6 @@
     </w:p>
     <w:p>
       <w:pPr>
-        <w:keepNext/>
         <w:spacing w:before="280" w:after="120" w:line="360" w:lineRule="auto"/>
         <w:jc w:val="both"/>
       </w:pPr>
@@ -94,6 +93,805 @@
     </w:p>
     <w:p>
       <w:pPr>
+        <w:spacing w:before="160" w:after="80"/>
+        <w:jc w:val="center"/>
+      </w:pPr>
+      <w:r>
+        <w:rPr>
+          <w:rFonts w:ascii="Times New Roman" w:hAnsi="Times New Roman"/>
+          <w:b/>
+          <w:sz w:val="21"/>
+        </w:rPr>
+        <w:t xml:space="preserve">Table 5.1: </w:t>
+      </w:r>
+      <w:r>
+        <w:rPr>
+          <w:rFonts w:ascii="Times New Roman" w:hAnsi="Times New Roman"/>
+          <w:i/>
+          <w:sz w:val="21"/>
+        </w:rPr>
+        <w:t>Research Objectives Verification Matrix</w:t>
+      </w:r>
+    </w:p>
+    <w:tbl>
+      <w:tblPr>
+        <w:tblW w:type="auto" w:w="0"/>
+        <w:jc w:val="center"/>
+        <w:tblLook w:firstColumn="1" w:firstRow="1" w:lastColumn="0" w:lastRow="0" w:noHBand="0" w:noVBand="1" w:val="04A0"/>
+        <w:tblBorders>
+          <w:top w:val="single" w:sz="4" w:space="0" w:color="CCCCCC"/>
+          <w:bottom w:val="single" w:sz="4" w:space="0" w:color="CCCCCC"/>
+          <w:left w:val="none"/>
+          <w:right w:val="none"/>
+          <w:insideH w:val="single" w:sz="4" w:space="0" w:color="CCCCCC"/>
+          <w:insideV w:val="none"/>
+        </w:tblBorders>
+      </w:tblPr>
+      <w:tblGrid>
+        <w:gridCol w:w="2340"/>
+        <w:gridCol w:w="2340"/>
+        <w:gridCol w:w="2340"/>
+        <w:gridCol w:w="2340"/>
+      </w:tblGrid>
+      <w:tr>
+        <w:tc>
+          <w:tcPr>
+            <w:tcW w:type="dxa" w:w="2340"/>
+            <w:shd w:fill="F2F2F2"/>
+            <w:tcMar>
+              <w:top w:w="140" w:type="dxa"/>
+              <w:bottom w:w="140" w:type="dxa"/>
+              <w:left w:w="180" w:type="dxa"/>
+              <w:right w:w="180" w:type="dxa"/>
+            </w:tcMar>
+          </w:tcPr>
+          <w:p>
+            <w:pPr>
+              <w:spacing w:line="276" w:lineRule="auto"/>
+              <w:jc w:val="left"/>
+            </w:pPr>
+            <w:r>
+              <w:rPr>
+                <w:rFonts w:ascii="Times New Roman" w:hAnsi="Times New Roman"/>
+                <w:b/>
+                <w:color w:val="000000"/>
+                <w:sz w:val="21"/>
+              </w:rPr>
+              <w:t>Project Research Objective (Section 1.4)</w:t>
+            </w:r>
+          </w:p>
+        </w:tc>
+        <w:tc>
+          <w:tcPr>
+            <w:tcW w:type="dxa" w:w="2340"/>
+            <w:shd w:fill="F2F2F2"/>
+            <w:tcMar>
+              <w:top w:w="140" w:type="dxa"/>
+              <w:bottom w:w="140" w:type="dxa"/>
+              <w:left w:w="180" w:type="dxa"/>
+              <w:right w:w="180" w:type="dxa"/>
+            </w:tcMar>
+          </w:tcPr>
+          <w:p>
+            <w:pPr>
+              <w:spacing w:line="276" w:lineRule="auto"/>
+              <w:jc w:val="left"/>
+            </w:pPr>
+            <w:r>
+              <w:rPr>
+                <w:rFonts w:ascii="Times New Roman" w:hAnsi="Times New Roman"/>
+                <w:b/>
+                <w:color w:val="000000"/>
+                <w:sz w:val="21"/>
+              </w:rPr>
+              <w:t>Implementation Feature / Module</w:t>
+            </w:r>
+          </w:p>
+        </w:tc>
+        <w:tc>
+          <w:tcPr>
+            <w:tcW w:type="dxa" w:w="2340"/>
+            <w:shd w:fill="F2F2F2"/>
+            <w:tcMar>
+              <w:top w:w="140" w:type="dxa"/>
+              <w:bottom w:w="140" w:type="dxa"/>
+              <w:left w:w="180" w:type="dxa"/>
+              <w:right w:w="180" w:type="dxa"/>
+            </w:tcMar>
+          </w:tcPr>
+          <w:p>
+            <w:pPr>
+              <w:spacing w:line="276" w:lineRule="auto"/>
+              <w:jc w:val="left"/>
+            </w:pPr>
+            <w:r>
+              <w:rPr>
+                <w:rFonts w:ascii="Times New Roman" w:hAnsi="Times New Roman"/>
+                <w:b/>
+                <w:color w:val="000000"/>
+                <w:sz w:val="21"/>
+              </w:rPr>
+              <w:t>Empirical Verification Evidence (Chapter 4)</w:t>
+            </w:r>
+          </w:p>
+        </w:tc>
+        <w:tc>
+          <w:tcPr>
+            <w:tcW w:type="dxa" w:w="2340"/>
+            <w:shd w:fill="F2F2F2"/>
+            <w:tcMar>
+              <w:top w:w="140" w:type="dxa"/>
+              <w:bottom w:w="140" w:type="dxa"/>
+              <w:left w:w="180" w:type="dxa"/>
+              <w:right w:w="180" w:type="dxa"/>
+            </w:tcMar>
+          </w:tcPr>
+          <w:p>
+            <w:pPr>
+              <w:spacing w:line="276" w:lineRule="auto"/>
+              <w:jc w:val="left"/>
+            </w:pPr>
+            <w:r>
+              <w:rPr>
+                <w:rFonts w:ascii="Times New Roman" w:hAnsi="Times New Roman"/>
+                <w:b/>
+                <w:color w:val="000000"/>
+                <w:sz w:val="21"/>
+              </w:rPr>
+              <w:t>Objective Status</w:t>
+            </w:r>
+          </w:p>
+        </w:tc>
+      </w:tr>
+      <w:tr>
+        <w:tc>
+          <w:tcPr>
+            <w:tcW w:type="dxa" w:w="2340"/>
+            <w:shd w:fill="FFFFFF"/>
+            <w:tcMar>
+              <w:top w:w="100" w:type="dxa"/>
+              <w:bottom w:w="100" w:type="dxa"/>
+              <w:left w:w="150" w:type="dxa"/>
+              <w:right w:w="150" w:type="dxa"/>
+            </w:tcMar>
+          </w:tcPr>
+          <w:p>
+            <w:pPr>
+              <w:spacing w:line="276" w:lineRule="auto"/>
+              <w:jc w:val="left"/>
+            </w:pPr>
+            <w:r>
+              <w:rPr>
+                <w:rFonts w:ascii="Times New Roman" w:hAnsi="Times New Roman"/>
+                <w:color w:val="000000"/>
+                <w:sz w:val="20"/>
+              </w:rPr>
+              <w:t>Objective 1: Survey existing cloud storage allocation mechanisms and identify cost/SLA trade-off gaps.</w:t>
+            </w:r>
+          </w:p>
+        </w:tc>
+        <w:tc>
+          <w:tcPr>
+            <w:tcW w:type="dxa" w:w="2340"/>
+            <w:shd w:fill="FFFFFF"/>
+            <w:tcMar>
+              <w:top w:w="100" w:type="dxa"/>
+              <w:bottom w:w="100" w:type="dxa"/>
+              <w:left w:w="150" w:type="dxa"/>
+              <w:right w:w="150" w:type="dxa"/>
+            </w:tcMar>
+          </w:tcPr>
+          <w:p>
+            <w:pPr>
+              <w:spacing w:line="276" w:lineRule="auto"/>
+              <w:jc w:val="left"/>
+            </w:pPr>
+            <w:r>
+              <w:rPr>
+                <w:rFonts w:ascii="Times New Roman" w:hAnsi="Times New Roman"/>
+                <w:color w:val="000000"/>
+                <w:sz w:val="20"/>
+              </w:rPr>
+              <w:t>Chapter 2 Literature Survey &amp; Chapter 3 Problem Formalization.</w:t>
+            </w:r>
+          </w:p>
+        </w:tc>
+        <w:tc>
+          <w:tcPr>
+            <w:tcW w:type="dxa" w:w="2340"/>
+            <w:shd w:fill="FFFFFF"/>
+            <w:tcMar>
+              <w:top w:w="100" w:type="dxa"/>
+              <w:bottom w:w="100" w:type="dxa"/>
+              <w:left w:w="150" w:type="dxa"/>
+              <w:right w:w="150" w:type="dxa"/>
+            </w:tcMar>
+          </w:tcPr>
+          <w:p>
+            <w:pPr>
+              <w:spacing w:line="276" w:lineRule="auto"/>
+              <w:jc w:val="left"/>
+            </w:pPr>
+            <w:r>
+              <w:rPr>
+                <w:rFonts w:ascii="Times New Roman" w:hAnsi="Times New Roman"/>
+                <w:color w:val="000000"/>
+                <w:sz w:val="20"/>
+              </w:rPr>
+              <w:t>Identified over-provisioning and cost inefficiencies in static First Fit, Best Fit, and Worst Fit rules.</w:t>
+            </w:r>
+          </w:p>
+        </w:tc>
+        <w:tc>
+          <w:tcPr>
+            <w:tcW w:type="dxa" w:w="2340"/>
+            <w:shd w:fill="FFFFFF"/>
+            <w:tcMar>
+              <w:top w:w="100" w:type="dxa"/>
+              <w:bottom w:w="100" w:type="dxa"/>
+              <w:left w:w="150" w:type="dxa"/>
+              <w:right w:w="150" w:type="dxa"/>
+            </w:tcMar>
+          </w:tcPr>
+          <w:p>
+            <w:pPr>
+              <w:spacing w:line="276" w:lineRule="auto"/>
+              <w:jc w:val="left"/>
+            </w:pPr>
+            <w:r>
+              <w:rPr>
+                <w:rFonts w:ascii="Times New Roman" w:hAnsi="Times New Roman"/>
+                <w:color w:val="000000"/>
+                <w:sz w:val="20"/>
+              </w:rPr>
+              <w:t>FULLY ACHIEVED</w:t>
+            </w:r>
+          </w:p>
+        </w:tc>
+      </w:tr>
+      <w:tr>
+        <w:tc>
+          <w:tcPr>
+            <w:tcW w:type="dxa" w:w="2340"/>
+            <w:shd w:fill="FAFAFA"/>
+            <w:tcMar>
+              <w:top w:w="100" w:type="dxa"/>
+              <w:bottom w:w="100" w:type="dxa"/>
+              <w:left w:w="150" w:type="dxa"/>
+              <w:right w:w="150" w:type="dxa"/>
+            </w:tcMar>
+          </w:tcPr>
+          <w:p>
+            <w:pPr>
+              <w:spacing w:line="276" w:lineRule="auto"/>
+              <w:jc w:val="left"/>
+            </w:pPr>
+            <w:r>
+              <w:rPr>
+                <w:rFonts w:ascii="Times New Roman" w:hAnsi="Times New Roman"/>
+                <w:color w:val="000000"/>
+                <w:sz w:val="20"/>
+              </w:rPr>
+              <w:t>Objective 2: Formulate a dual-objective greedy heuristic algorithm balancing cost reduction and SLA availability.</w:t>
+            </w:r>
+          </w:p>
+        </w:tc>
+        <w:tc>
+          <w:tcPr>
+            <w:tcW w:type="dxa" w:w="2340"/>
+            <w:shd w:fill="FAFAFA"/>
+            <w:tcMar>
+              <w:top w:w="100" w:type="dxa"/>
+              <w:bottom w:w="100" w:type="dxa"/>
+              <w:left w:w="150" w:type="dxa"/>
+              <w:right w:w="150" w:type="dxa"/>
+            </w:tcMar>
+          </w:tcPr>
+          <w:p>
+            <w:pPr>
+              <w:spacing w:line="276" w:lineRule="auto"/>
+              <w:jc w:val="left"/>
+            </w:pPr>
+            <w:r>
+              <w:rPr>
+                <w:rFonts w:ascii="Times New Roman" w:hAnsi="Times New Roman"/>
+                <w:color w:val="000000"/>
+                <w:sz w:val="20"/>
+              </w:rPr>
+              <w:t>Implemented Min-Max normalized scoring (α × C_norm + β × U_norm) in heuristic.py.</w:t>
+            </w:r>
+          </w:p>
+        </w:tc>
+        <w:tc>
+          <w:tcPr>
+            <w:tcW w:type="dxa" w:w="2340"/>
+            <w:shd w:fill="FAFAFA"/>
+            <w:tcMar>
+              <w:top w:w="100" w:type="dxa"/>
+              <w:bottom w:w="100" w:type="dxa"/>
+              <w:left w:w="150" w:type="dxa"/>
+              <w:right w:w="150" w:type="dxa"/>
+            </w:tcMar>
+          </w:tcPr>
+          <w:p>
+            <w:pPr>
+              <w:spacing w:line="276" w:lineRule="auto"/>
+              <w:jc w:val="left"/>
+            </w:pPr>
+            <w:r>
+              <w:rPr>
+                <w:rFonts w:ascii="Times New Roman" w:hAnsi="Times New Roman"/>
+                <w:color w:val="000000"/>
+                <w:sz w:val="20"/>
+              </w:rPr>
+              <w:t>Benchmark of 500 requests demonstrated 17.81% cost savings ($62.74 vs $76.33 mean cost).</w:t>
+            </w:r>
+          </w:p>
+        </w:tc>
+        <w:tc>
+          <w:tcPr>
+            <w:tcW w:type="dxa" w:w="2340"/>
+            <w:shd w:fill="FAFAFA"/>
+            <w:tcMar>
+              <w:top w:w="100" w:type="dxa"/>
+              <w:bottom w:w="100" w:type="dxa"/>
+              <w:left w:w="150" w:type="dxa"/>
+              <w:right w:w="150" w:type="dxa"/>
+            </w:tcMar>
+          </w:tcPr>
+          <w:p>
+            <w:pPr>
+              <w:spacing w:line="276" w:lineRule="auto"/>
+              <w:jc w:val="left"/>
+            </w:pPr>
+            <w:r>
+              <w:rPr>
+                <w:rFonts w:ascii="Times New Roman" w:hAnsi="Times New Roman"/>
+                <w:color w:val="000000"/>
+                <w:sz w:val="20"/>
+              </w:rPr>
+              <w:t>FULLY ACHIEVED</w:t>
+            </w:r>
+          </w:p>
+        </w:tc>
+      </w:tr>
+      <w:tr>
+        <w:tc>
+          <w:tcPr>
+            <w:tcW w:type="dxa" w:w="2340"/>
+            <w:shd w:fill="FFFFFF"/>
+            <w:tcMar>
+              <w:top w:w="100" w:type="dxa"/>
+              <w:bottom w:w="100" w:type="dxa"/>
+              <w:left w:w="150" w:type="dxa"/>
+              <w:right w:w="150" w:type="dxa"/>
+            </w:tcMar>
+          </w:tcPr>
+          <w:p>
+            <w:pPr>
+              <w:spacing w:line="276" w:lineRule="auto"/>
+              <w:jc w:val="left"/>
+            </w:pPr>
+            <w:r>
+              <w:rPr>
+                <w:rFonts w:ascii="Times New Roman" w:hAnsi="Times New Roman"/>
+                <w:color w:val="000000"/>
+                <w:sz w:val="20"/>
+              </w:rPr>
+              <w:t>Objective 3: Develop an automated workload profile estimation engine for storage size recommendations.</w:t>
+            </w:r>
+          </w:p>
+        </w:tc>
+        <w:tc>
+          <w:tcPr>
+            <w:tcW w:type="dxa" w:w="2340"/>
+            <w:shd w:fill="FFFFFF"/>
+            <w:tcMar>
+              <w:top w:w="100" w:type="dxa"/>
+              <w:bottom w:w="100" w:type="dxa"/>
+              <w:left w:w="150" w:type="dxa"/>
+              <w:right w:w="150" w:type="dxa"/>
+            </w:tcMar>
+          </w:tcPr>
+          <w:p>
+            <w:pPr>
+              <w:spacing w:line="276" w:lineRule="auto"/>
+              <w:jc w:val="left"/>
+            </w:pPr>
+            <w:r>
+              <w:rPr>
+                <w:rFonts w:ascii="Times New Roman" w:hAnsi="Times New Roman"/>
+                <w:color w:val="000000"/>
+                <w:sz w:val="20"/>
+              </w:rPr>
+              <w:t>Implemented Workload Auto-Suggest Engine in heuristic.py &amp; modules/allocation.py.</w:t>
+            </w:r>
+          </w:p>
+        </w:tc>
+        <w:tc>
+          <w:tcPr>
+            <w:tcW w:type="dxa" w:w="2340"/>
+            <w:shd w:fill="FFFFFF"/>
+            <w:tcMar>
+              <w:top w:w="100" w:type="dxa"/>
+              <w:bottom w:w="100" w:type="dxa"/>
+              <w:left w:w="150" w:type="dxa"/>
+              <w:right w:w="150" w:type="dxa"/>
+            </w:tcMar>
+          </w:tcPr>
+          <w:p>
+            <w:pPr>
+              <w:spacing w:line="276" w:lineRule="auto"/>
+              <w:jc w:val="left"/>
+            </w:pPr>
+            <w:r>
+              <w:rPr>
+                <w:rFonts w:ascii="Times New Roman" w:hAnsi="Times New Roman"/>
+                <w:color w:val="000000"/>
+                <w:sz w:val="20"/>
+              </w:rPr>
+              <w:t>Test Cases TC-11 &amp; TC-12 validated accurate storage sizing across 5 enterprise workload profiles.</w:t>
+            </w:r>
+          </w:p>
+        </w:tc>
+        <w:tc>
+          <w:tcPr>
+            <w:tcW w:type="dxa" w:w="2340"/>
+            <w:shd w:fill="FFFFFF"/>
+            <w:tcMar>
+              <w:top w:w="100" w:type="dxa"/>
+              <w:bottom w:w="100" w:type="dxa"/>
+              <w:left w:w="150" w:type="dxa"/>
+              <w:right w:w="150" w:type="dxa"/>
+            </w:tcMar>
+          </w:tcPr>
+          <w:p>
+            <w:pPr>
+              <w:spacing w:line="276" w:lineRule="auto"/>
+              <w:jc w:val="left"/>
+            </w:pPr>
+            <w:r>
+              <w:rPr>
+                <w:rFonts w:ascii="Times New Roman" w:hAnsi="Times New Roman"/>
+                <w:color w:val="000000"/>
+                <w:sz w:val="20"/>
+              </w:rPr>
+              <w:t>FULLY ACHIEVED</w:t>
+            </w:r>
+          </w:p>
+        </w:tc>
+      </w:tr>
+      <w:tr>
+        <w:tc>
+          <w:tcPr>
+            <w:tcW w:type="dxa" w:w="2340"/>
+            <w:shd w:fill="FAFAFA"/>
+            <w:tcMar>
+              <w:top w:w="100" w:type="dxa"/>
+              <w:bottom w:w="100" w:type="dxa"/>
+              <w:left w:w="150" w:type="dxa"/>
+              <w:right w:w="150" w:type="dxa"/>
+            </w:tcMar>
+          </w:tcPr>
+          <w:p>
+            <w:pPr>
+              <w:spacing w:line="276" w:lineRule="auto"/>
+              <w:jc w:val="left"/>
+            </w:pPr>
+            <w:r>
+              <w:rPr>
+                <w:rFonts w:ascii="Times New Roman" w:hAnsi="Times New Roman"/>
+                <w:color w:val="000000"/>
+                <w:sz w:val="20"/>
+              </w:rPr>
+              <w:t>Objective 4: Construct a functional prototype web application platform for interactive simulation and evaluation.</w:t>
+            </w:r>
+          </w:p>
+        </w:tc>
+        <w:tc>
+          <w:tcPr>
+            <w:tcW w:type="dxa" w:w="2340"/>
+            <w:shd w:fill="FAFAFA"/>
+            <w:tcMar>
+              <w:top w:w="100" w:type="dxa"/>
+              <w:bottom w:w="100" w:type="dxa"/>
+              <w:left w:w="150" w:type="dxa"/>
+              <w:right w:w="150" w:type="dxa"/>
+            </w:tcMar>
+          </w:tcPr>
+          <w:p>
+            <w:pPr>
+              <w:spacing w:line="276" w:lineRule="auto"/>
+              <w:jc w:val="left"/>
+            </w:pPr>
+            <w:r>
+              <w:rPr>
+                <w:rFonts w:ascii="Times New Roman" w:hAnsi="Times New Roman"/>
+                <w:color w:val="000000"/>
+                <w:sz w:val="20"/>
+              </w:rPr>
+              <w:t>Single-page Streamlit web platform (app.py, modules/) with real-time UI views (Figures 4.1–4.4).</w:t>
+            </w:r>
+          </w:p>
+        </w:tc>
+        <w:tc>
+          <w:tcPr>
+            <w:tcW w:type="dxa" w:w="2340"/>
+            <w:shd w:fill="FAFAFA"/>
+            <w:tcMar>
+              <w:top w:w="100" w:type="dxa"/>
+              <w:bottom w:w="100" w:type="dxa"/>
+              <w:left w:w="150" w:type="dxa"/>
+              <w:right w:w="150" w:type="dxa"/>
+            </w:tcMar>
+          </w:tcPr>
+          <w:p>
+            <w:pPr>
+              <w:spacing w:line="276" w:lineRule="auto"/>
+              <w:jc w:val="left"/>
+            </w:pPr>
+            <w:r>
+              <w:rPr>
+                <w:rFonts w:ascii="Times New Roman" w:hAnsi="Times New Roman"/>
+                <w:color w:val="000000"/>
+                <w:sz w:val="20"/>
+              </w:rPr>
+              <w:t>Interactive UI captured in high-resolution figures; validated across 12 automated test cases.</w:t>
+            </w:r>
+          </w:p>
+        </w:tc>
+        <w:tc>
+          <w:tcPr>
+            <w:tcW w:type="dxa" w:w="2340"/>
+            <w:shd w:fill="FAFAFA"/>
+            <w:tcMar>
+              <w:top w:w="100" w:type="dxa"/>
+              <w:bottom w:w="100" w:type="dxa"/>
+              <w:left w:w="150" w:type="dxa"/>
+              <w:right w:w="150" w:type="dxa"/>
+            </w:tcMar>
+          </w:tcPr>
+          <w:p>
+            <w:pPr>
+              <w:spacing w:line="276" w:lineRule="auto"/>
+              <w:jc w:val="left"/>
+            </w:pPr>
+            <w:r>
+              <w:rPr>
+                <w:rFonts w:ascii="Times New Roman" w:hAnsi="Times New Roman"/>
+                <w:color w:val="000000"/>
+                <w:sz w:val="20"/>
+              </w:rPr>
+              <w:t>FULLY ACHIEVED</w:t>
+            </w:r>
+          </w:p>
+        </w:tc>
+      </w:tr>
+      <w:tr>
+        <w:tc>
+          <w:tcPr>
+            <w:tcW w:type="dxa" w:w="2340"/>
+            <w:shd w:fill="FFFFFF"/>
+            <w:tcMar>
+              <w:top w:w="100" w:type="dxa"/>
+              <w:bottom w:w="100" w:type="dxa"/>
+              <w:left w:w="150" w:type="dxa"/>
+              <w:right w:w="150" w:type="dxa"/>
+            </w:tcMar>
+          </w:tcPr>
+          <w:p>
+            <w:pPr>
+              <w:spacing w:line="276" w:lineRule="auto"/>
+              <w:jc w:val="left"/>
+            </w:pPr>
+            <w:r>
+              <w:rPr>
+                <w:rFonts w:ascii="Times New Roman" w:hAnsi="Times New Roman"/>
+                <w:color w:val="000000"/>
+                <w:sz w:val="20"/>
+              </w:rPr>
+              <w:t>Objective 5: Implement persistent allocation transaction logging and audit reporting mechanisms.</w:t>
+            </w:r>
+          </w:p>
+        </w:tc>
+        <w:tc>
+          <w:tcPr>
+            <w:tcW w:type="dxa" w:w="2340"/>
+            <w:shd w:fill="FFFFFF"/>
+            <w:tcMar>
+              <w:top w:w="100" w:type="dxa"/>
+              <w:bottom w:w="100" w:type="dxa"/>
+              <w:left w:w="150" w:type="dxa"/>
+              <w:right w:w="150" w:type="dxa"/>
+            </w:tcMar>
+          </w:tcPr>
+          <w:p>
+            <w:pPr>
+              <w:spacing w:line="276" w:lineRule="auto"/>
+              <w:jc w:val="left"/>
+            </w:pPr>
+            <w:r>
+              <w:rPr>
+                <w:rFonts w:ascii="Times New Roman" w:hAnsi="Times New Roman"/>
+                <w:color w:val="000000"/>
+                <w:sz w:val="20"/>
+              </w:rPr>
+              <w:t>SQLite relational schema (storage_allocation.db) and CSV export in database.py &amp; reporting.py.</w:t>
+            </w:r>
+          </w:p>
+        </w:tc>
+        <w:tc>
+          <w:tcPr>
+            <w:tcW w:type="dxa" w:w="2340"/>
+            <w:shd w:fill="FFFFFF"/>
+            <w:tcMar>
+              <w:top w:w="100" w:type="dxa"/>
+              <w:bottom w:w="100" w:type="dxa"/>
+              <w:left w:w="150" w:type="dxa"/>
+              <w:right w:w="150" w:type="dxa"/>
+            </w:tcMar>
+          </w:tcPr>
+          <w:p>
+            <w:pPr>
+              <w:spacing w:line="276" w:lineRule="auto"/>
+              <w:jc w:val="left"/>
+            </w:pPr>
+            <w:r>
+              <w:rPr>
+                <w:rFonts w:ascii="Times New Roman" w:hAnsi="Times New Roman"/>
+                <w:color w:val="000000"/>
+                <w:sz w:val="20"/>
+              </w:rPr>
+              <w:t>Test Cases TC-05 &amp; TC-08 verified database persistence and CSV export functionality.</w:t>
+            </w:r>
+          </w:p>
+        </w:tc>
+        <w:tc>
+          <w:tcPr>
+            <w:tcW w:type="dxa" w:w="2340"/>
+            <w:shd w:fill="FFFFFF"/>
+            <w:tcMar>
+              <w:top w:w="100" w:type="dxa"/>
+              <w:bottom w:w="100" w:type="dxa"/>
+              <w:left w:w="150" w:type="dxa"/>
+              <w:right w:w="150" w:type="dxa"/>
+            </w:tcMar>
+          </w:tcPr>
+          <w:p>
+            <w:pPr>
+              <w:spacing w:line="276" w:lineRule="auto"/>
+              <w:jc w:val="left"/>
+            </w:pPr>
+            <w:r>
+              <w:rPr>
+                <w:rFonts w:ascii="Times New Roman" w:hAnsi="Times New Roman"/>
+                <w:color w:val="000000"/>
+                <w:sz w:val="20"/>
+              </w:rPr>
+              <w:t>FULLY ACHIEVED</w:t>
+            </w:r>
+          </w:p>
+        </w:tc>
+      </w:tr>
+      <w:tr>
+        <w:tc>
+          <w:tcPr>
+            <w:tcW w:type="dxa" w:w="2340"/>
+            <w:shd w:fill="FAFAFA"/>
+            <w:tcMar>
+              <w:top w:w="100" w:type="dxa"/>
+              <w:bottom w:w="100" w:type="dxa"/>
+              <w:left w:w="150" w:type="dxa"/>
+              <w:right w:w="150" w:type="dxa"/>
+            </w:tcMar>
+          </w:tcPr>
+          <w:p>
+            <w:pPr>
+              <w:spacing w:line="276" w:lineRule="auto"/>
+              <w:jc w:val="left"/>
+            </w:pPr>
+            <w:r>
+              <w:rPr>
+                <w:rFonts w:ascii="Times New Roman" w:hAnsi="Times New Roman"/>
+                <w:color w:val="000000"/>
+                <w:sz w:val="20"/>
+              </w:rPr>
+              <w:t>Objective 6: Empirically evaluate system performance under varying workloads and trade-off priority weights.</w:t>
+            </w:r>
+          </w:p>
+        </w:tc>
+        <w:tc>
+          <w:tcPr>
+            <w:tcW w:type="dxa" w:w="2340"/>
+            <w:shd w:fill="FAFAFA"/>
+            <w:tcMar>
+              <w:top w:w="100" w:type="dxa"/>
+              <w:bottom w:w="100" w:type="dxa"/>
+              <w:left w:w="150" w:type="dxa"/>
+              <w:right w:w="150" w:type="dxa"/>
+            </w:tcMar>
+          </w:tcPr>
+          <w:p>
+            <w:pPr>
+              <w:spacing w:line="276" w:lineRule="auto"/>
+              <w:jc w:val="left"/>
+            </w:pPr>
+            <w:r>
+              <w:rPr>
+                <w:rFonts w:ascii="Times New Roman" w:hAnsi="Times New Roman"/>
+                <w:color w:val="000000"/>
+                <w:sz w:val="20"/>
+              </w:rPr>
+              <w:t>Sensitivity analysis across α ∈ [0.0, 1.0] and 500-request workload benchmark.</w:t>
+            </w:r>
+          </w:p>
+        </w:tc>
+        <w:tc>
+          <w:tcPr>
+            <w:tcW w:type="dxa" w:w="2340"/>
+            <w:shd w:fill="FAFAFA"/>
+            <w:tcMar>
+              <w:top w:w="100" w:type="dxa"/>
+              <w:bottom w:w="100" w:type="dxa"/>
+              <w:left w:w="150" w:type="dxa"/>
+              <w:right w:w="150" w:type="dxa"/>
+            </w:tcMar>
+          </w:tcPr>
+          <w:p>
+            <w:pPr>
+              <w:spacing w:line="276" w:lineRule="auto"/>
+              <w:jc w:val="left"/>
+            </w:pPr>
+            <w:r>
+              <w:rPr>
+                <w:rFonts w:ascii="Times New Roman" w:hAnsi="Times New Roman"/>
+                <w:color w:val="000000"/>
+                <w:sz w:val="20"/>
+              </w:rPr>
+              <w:t>Tables 4.3 &amp; 4.4 documented cost curves, tier selection shifts, and 0% SLA violation rates.</w:t>
+            </w:r>
+          </w:p>
+        </w:tc>
+        <w:tc>
+          <w:tcPr>
+            <w:tcW w:type="dxa" w:w="2340"/>
+            <w:shd w:fill="FAFAFA"/>
+            <w:tcMar>
+              <w:top w:w="100" w:type="dxa"/>
+              <w:bottom w:w="100" w:type="dxa"/>
+              <w:left w:w="150" w:type="dxa"/>
+              <w:right w:w="150" w:type="dxa"/>
+            </w:tcMar>
+          </w:tcPr>
+          <w:p>
+            <w:pPr>
+              <w:spacing w:line="276" w:lineRule="auto"/>
+              <w:jc w:val="left"/>
+            </w:pPr>
+            <w:r>
+              <w:rPr>
+                <w:rFonts w:ascii="Times New Roman" w:hAnsi="Times New Roman"/>
+                <w:color w:val="000000"/>
+                <w:sz w:val="20"/>
+              </w:rPr>
+              <w:t>FULLY ACHIEVED</w:t>
+            </w:r>
+          </w:p>
+        </w:tc>
+      </w:tr>
+    </w:tbl>
+    <w:p>
+      <w:pPr>
+        <w:spacing w:after="240"/>
+      </w:pPr>
+    </w:p>
+    <w:p>
+      <w:pPr>
+        <w:spacing w:after="240"/>
+      </w:pPr>
+    </w:p>
+    <w:p>
+      <w:pPr>
         <w:spacing w:before="0" w:after="120" w:line="360" w:lineRule="auto"/>
         <w:jc w:val="both"/>
       </w:pPr>
@@ -116,7 +914,6 @@
     </w:p>
     <w:p>
       <w:pPr>
-        <w:keepNext/>
         <w:spacing w:before="280" w:after="120" w:line="360" w:lineRule="auto"/>
         <w:jc w:val="both"/>
       </w:pPr>
@@ -399,7 +1196,6 @@
     </w:p>
     <w:p>
       <w:pPr>
-        <w:keepNext/>
         <w:spacing w:before="280" w:after="120" w:line="360" w:lineRule="auto"/>
         <w:jc w:val="both"/>
       </w:pPr>
@@ -592,7 +1388,6 @@
     </w:p>
     <w:p>
       <w:pPr>
-        <w:keepNext/>
         <w:spacing w:before="280" w:after="120" w:line="360" w:lineRule="auto"/>
         <w:jc w:val="both"/>
       </w:pPr>
@@ -609,36 +1404,23 @@
     </w:p>
     <w:p>
       <w:pPr>
-        <w:spacing w:before="0" w:after="120" w:line="360" w:lineRule="auto"/>
-        <w:jc w:val="both"/>
+        <w:spacing w:after="240"/>
       </w:pPr>
-      <w:r>
-        <w:rPr>
-          <w:rFonts w:ascii="Times New Roman" w:hAnsi="Times New Roman"/>
-          <w:b w:val="0"/>
-          <w:i w:val="0"/>
-          <w:color w:val="000000"/>
-          <w:sz w:val="24"/>
-        </w:rPr>
-        <w:t>Table 5.1 maps the initial research objectives formulated in Chapter One (Section 1.4) against technical implementations in Chapter Three and empirical validation evidence from Chapter Four.</w:t>
-      </w:r>
     </w:p>
     <w:p>
       <w:pPr>
-        <w:keepNext/>
-        <w:spacing w:before="240" w:after="80" w:line="360" w:lineRule="auto"/>
-        <w:jc w:val="both"/>
+        <w:spacing w:after="240"/>
       </w:pPr>
-      <w:r>
-        <w:rPr>
-          <w:rFonts w:ascii="Times New Roman" w:hAnsi="Times New Roman"/>
-          <w:b/>
-          <w:i w:val="0"/>
-          <w:color w:val="000000"/>
-          <w:sz w:val="25"/>
-        </w:rPr>
-        <w:t>Table 5.1: Research Objectives Verification Matrix</w:t>
-      </w:r>
+    </w:p>
+    <w:p>
+      <w:pPr>
+        <w:spacing w:after="240"/>
+      </w:pPr>
+    </w:p>
+    <w:p>
+      <w:pPr>
+        <w:spacing w:after="240"/>
+      </w:pPr>
     </w:p>
     <w:p>
       <w:pPr>
@@ -648,7 +1430,6 @@
     </w:p>
     <w:p>
       <w:pPr>
-        <w:keepNext/>
         <w:spacing w:before="280" w:after="120" w:line="360" w:lineRule="auto"/>
         <w:jc w:val="both"/>
       </w:pPr>
@@ -795,7 +1576,6 @@
     </w:p>
     <w:p>
       <w:pPr>
-        <w:keepNext/>
         <w:spacing w:before="280" w:after="120" w:line="360" w:lineRule="auto"/>
         <w:jc w:val="both"/>
       </w:pPr>
@@ -978,7 +1758,6 @@
     </w:p>
     <w:p>
       <w:pPr>
-        <w:keepNext/>
         <w:spacing w:before="280" w:after="120" w:line="360" w:lineRule="auto"/>
         <w:jc w:val="both"/>
       </w:pPr>
@@ -1125,7 +1904,6 @@
     </w:p>
     <w:p>
       <w:pPr>
-        <w:keepNext/>
         <w:spacing w:before="280" w:after="120" w:line="360" w:lineRule="auto"/>
         <w:jc w:val="both"/>
       </w:pPr>
@@ -1142,7 +1920,6 @@
     </w:p>
     <w:p>
       <w:pPr>
-        <w:keepNext/>
         <w:spacing w:before="240" w:after="80" w:line="360" w:lineRule="auto"/>
         <w:jc w:val="both"/>
       </w:pPr>
@@ -1231,7 +2008,6 @@
     </w:p>
     <w:p>
       <w:pPr>
-        <w:keepNext/>
         <w:spacing w:before="240" w:after="80" w:line="360" w:lineRule="auto"/>
         <w:jc w:val="both"/>
       </w:pPr>
@@ -1346,7 +2122,6 @@
     </w:p>
     <w:p>
       <w:pPr>
-        <w:keepNext/>
         <w:spacing w:before="280" w:after="120" w:line="360" w:lineRule="auto"/>
         <w:jc w:val="both"/>
       </w:pPr>
@@ -1547,7 +2322,6 @@
     </w:p>
     <w:p>
       <w:pPr>
-        <w:keepNext/>
         <w:spacing w:before="280" w:after="120" w:line="360" w:lineRule="auto"/>
         <w:jc w:val="both"/>
       </w:pPr>
@@ -1744,7 +2518,6 @@
     </w:p>
     <w:p>
       <w:pPr>
-        <w:keepNext/>
         <w:spacing w:before="280" w:after="120" w:line="360" w:lineRule="auto"/>
         <w:jc w:val="both"/>
       </w:pPr>

</xml_diff>